<commit_message>
Rehacer como presentacion de una persona (tema: umari)
</commit_message>
<xml_diff>
--- a/Proyectos/Uitoto/Dialogo-Uitoto-BORRADOR.docx
+++ b/Proyectos/Uitoto/Dialogo-Uitoto-BORRADOR.docx
@@ -3,9 +3,6 @@
 <w:document xmlns:wpc="http://schemas.microsoft.com/office/word/2010/wordprocessingCanvas" xmlns:mo="http://schemas.microsoft.com/office/mac/office/2008/main" xmlns:mc="http://schemas.openxmlformats.org/markup-compatibility/2006" xmlns:mv="urn:schemas-microsoft-com:mac:vml" xmlns:o="urn:schemas-microsoft-com:office:office" xmlns:r="http://schemas.openxmlformats.org/officeDocument/2006/relationships" xmlns:m="http://schemas.openxmlformats.org/officeDocument/2006/math" xmlns:v="urn:schemas-microsoft-com:vml" xmlns:wp14="http://schemas.microsoft.com/office/word/2010/wordprocessingDrawing" xmlns:wp="http://schemas.openxmlformats.org/drawingml/2006/wordprocessingDrawing" xmlns:w10="urn:schemas-microsoft-com:office:word" xmlns:w="http://schemas.openxmlformats.org/wordprocessingml/2006/main" xmlns:w14="http://schemas.microsoft.com/office/word/2010/wordml" xmlns:wpg="http://schemas.microsoft.com/office/word/2010/wordprocessingGroup" xmlns:wpi="http://schemas.microsoft.com/office/word/2010/wordprocessingInk" xmlns:wne="http://schemas.microsoft.com/office/word/2006/wordml" xmlns:wps="http://schemas.microsoft.com/office/word/2010/wordprocessingShape" mc:Ignorable="w14 wp14">
   <w:body>
     <w:p>
-      <w:pPr>
-        <w:jc w:val="center"/>
-      </w:pPr>
       <w:r>
         <w:rPr>
           <w:b/>
@@ -15,9 +12,6 @@
       </w:r>
     </w:p>
     <w:p>
-      <w:pPr>
-        <w:jc w:val="center"/>
-      </w:pPr>
       <w:r>
         <w:rPr>
           <w:b/>
@@ -27,15 +21,21 @@
       </w:r>
     </w:p>
     <w:p>
-      <w:pPr>
-        <w:jc w:val="center"/>
-      </w:pPr>
       <w:r>
         <w:rPr>
           <w:b/>
           <w:sz w:val="24"/>
         </w:rPr>
         <w:t>Departamento de Lingüística y Filología Clásica</w:t>
+      </w:r>
+    </w:p>
+    <w:p>
+      <w:r>
+        <w:rPr>
+          <w:b/>
+          <w:sz w:val="24"/>
+        </w:rPr>
+        <w:t>[TU NOMBRE COMPLETO]</w:t>
       </w:r>
     </w:p>
     <w:p/>
@@ -46,20 +46,9 @@
       <w:r>
         <w:rPr>
           <w:b/>
-          <w:sz w:val="32"/>
+          <w:sz w:val="30"/>
         </w:rPr>
-        <w:t>Diálogo en Uitoto (Muruy Muina)</w:t>
-      </w:r>
-    </w:p>
-    <w:p>
-      <w:pPr>
-        <w:jc w:val="center"/>
-      </w:pPr>
-      <w:r>
-        <w:rPr>
-          <w:i/>
-        </w:rPr>
-        <w:t>Tema: La chagra, los frutos y la chicha</w:t>
+        <w:t>Diálogo Muruy Muina</w:t>
       </w:r>
     </w:p>
     <w:p/>
@@ -67,1078 +56,227 @@
       <w:r>
         <w:rPr>
           <w:b/>
+          <w:sz w:val="24"/>
         </w:rPr>
-        <w:t xml:space="preserve">JUANA: </w:t>
-      </w:r>
-      <w:r>
-        <w:rPr>
-          <w:b/>
-          <w:color w:val="1F4E79"/>
-        </w:rPr>
-        <w:t>Mey m+n+ca?</w:t>
+        <w:t>Ka+mak+ it+uomo+?</w:t>
       </w:r>
     </w:p>
     <w:p>
-      <w:pPr>
-        <w:ind w:left="480"/>
-      </w:pPr>
       <w:r>
         <w:rPr>
           <w:i/>
+          <w:u w:val="single"/>
         </w:rPr>
-        <w:t>¿Cómo estás?</w:t>
+        <w:t>¿Cómo están ustedes?</w:t>
       </w:r>
     </w:p>
     <w:p>
       <w:r>
         <w:rPr>
           <w:b/>
+          <w:sz w:val="24"/>
         </w:rPr>
-        <w:t xml:space="preserve">PEDRO: </w:t>
-      </w:r>
-      <w:r>
-        <w:rPr>
-          <w:b/>
-          <w:color w:val="1F4E79"/>
-        </w:rPr>
-        <w:t>Ñuera. N+gafue rafue?</w:t>
+        <w:t>Kue mamek+ [TU NOMBRE]+kue</w:t>
       </w:r>
     </w:p>
     <w:p>
-      <w:pPr>
-        <w:ind w:left="480"/>
-      </w:pPr>
       <w:r>
         <w:rPr>
           <w:i/>
+          <w:u w:val="single"/>
         </w:rPr>
-        <w:t>Bien. ¿Qué hay de nuevo?</w:t>
+        <w:t>Mi nombre es [TU NOMBRE].</w:t>
       </w:r>
     </w:p>
     <w:p>
       <w:r>
         <w:rPr>
           <w:b/>
+          <w:sz w:val="24"/>
         </w:rPr>
-        <w:t xml:space="preserve">JUANA: </w:t>
-      </w:r>
-      <w:r>
-        <w:rPr>
-          <w:b/>
-          <w:color w:val="1F4E79"/>
-        </w:rPr>
-        <w:t>Kue ta+j+a jakafa+mo.</w:t>
+        <w:t>Nemoz+ uai keu fiaide</w:t>
       </w:r>
     </w:p>
     <w:p>
-      <w:pPr>
-        <w:ind w:left="480"/>
-      </w:pPr>
       <w:r>
         <w:rPr>
           <w:i/>
+          <w:u w:val="single"/>
         </w:rPr>
-        <w:t>Yo trabajo en la chagra.</w:t>
+        <w:t>El tema que elijo es el umarí.</w:t>
       </w:r>
     </w:p>
     <w:p>
       <w:r>
         <w:rPr>
           <w:b/>
+          <w:sz w:val="24"/>
         </w:rPr>
-        <w:t xml:space="preserve">PEDRO: </w:t>
-      </w:r>
-      <w:r>
-        <w:rPr>
-          <w:b/>
-          <w:color w:val="1F4E79"/>
-        </w:rPr>
-        <w:t>N+e izoy o jakafa+?</w:t>
+        <w:t>Kue nemoz+ ga+de, nemoz+ borarede ite, jénide iemei ka+merede.</w:t>
       </w:r>
     </w:p>
     <w:p>
-      <w:pPr>
-        <w:ind w:left="480"/>
-      </w:pPr>
       <w:r>
         <w:rPr>
           <w:i/>
+          <w:u w:val="single"/>
         </w:rPr>
-        <w:t>¿Cómo es tu chagra?</w:t>
+        <w:t>Me gusta el umarí, el umarí es amarillo, pequeño y sabroso.</w:t>
       </w:r>
     </w:p>
     <w:p>
       <w:r>
         <w:rPr>
           <w:b/>
+          <w:sz w:val="24"/>
         </w:rPr>
-        <w:t xml:space="preserve">JUANA: </w:t>
-      </w:r>
-      <w:r>
-        <w:rPr>
-          <w:b/>
-          <w:color w:val="1F4E79"/>
-        </w:rPr>
-        <w:t>Kue jakafa+ ñuera. Jimek+ iemei nemoz+ ite.</w:t>
+        <w:t>Ka+merede nemoz+ juíñoi jiroite</w:t>
       </w:r>
     </w:p>
     <w:p>
-      <w:pPr>
-        <w:ind w:left="480"/>
-      </w:pPr>
       <w:r>
         <w:rPr>
           <w:i/>
+          <w:u w:val="single"/>
         </w:rPr>
-        <w:t>Mi chagra es buena. Hay chontaduro y umarí.</w:t>
+        <w:t>Yo tomé una chicha de umarí sabrosa.</w:t>
       </w:r>
     </w:p>
     <w:p>
       <w:r>
         <w:rPr>
           <w:b/>
+          <w:sz w:val="24"/>
         </w:rPr>
-        <w:t xml:space="preserve">PEDRO: </w:t>
-      </w:r>
-      <w:r>
-        <w:rPr>
-          <w:b/>
-          <w:color w:val="1F4E79"/>
-        </w:rPr>
-        <w:t>Jimek+ n+e izoy?</w:t>
+        <w:t>Kue nemoz+ gui ga+d+kue</w:t>
       </w:r>
     </w:p>
     <w:p>
-      <w:pPr>
-        <w:ind w:left="480"/>
-      </w:pPr>
       <w:r>
         <w:rPr>
           <w:i/>
+          <w:u w:val="single"/>
         </w:rPr>
-        <w:t>¿Cómo es el chontaduro?</w:t>
+        <w:t>Me gusta comer umarí.</w:t>
       </w:r>
     </w:p>
     <w:p>
       <w:r>
         <w:rPr>
           <w:b/>
+          <w:sz w:val="24"/>
         </w:rPr>
-        <w:t xml:space="preserve">JUANA: </w:t>
-      </w:r>
-      <w:r>
-        <w:rPr>
-          <w:b/>
-          <w:color w:val="1F4E79"/>
-        </w:rPr>
-        <w:t>Jimek+ jia+rede iemei ka+merede. Nemoz+ borarede.</w:t>
+        <w:t>Nemoz+ jazik+mo ite iemei rafe ite.</w:t>
       </w:r>
     </w:p>
     <w:p>
-      <w:pPr>
-        <w:ind w:left="480"/>
-      </w:pPr>
       <w:r>
         <w:rPr>
           <w:i/>
+          <w:u w:val="single"/>
         </w:rPr>
-        <w:t>El chontaduro es rojo y sabroso. El umarí es amarillo.</w:t>
+        <w:t>El umarí está en el monte y es un alimento nutritivo.</w:t>
       </w:r>
     </w:p>
     <w:p>
       <w:r>
         <w:rPr>
           <w:b/>
+          <w:sz w:val="24"/>
         </w:rPr>
-        <w:t xml:space="preserve">PEDRO: </w:t>
-      </w:r>
-      <w:r>
-        <w:rPr>
-          <w:b/>
-          <w:color w:val="1F4E79"/>
-        </w:rPr>
-        <w:t>Ka+ jiroid+ka+ juíñoi?</w:t>
+        <w:t>F+gora</w:t>
       </w:r>
     </w:p>
     <w:p>
-      <w:pPr>
-        <w:ind w:left="480"/>
-      </w:pPr>
       <w:r>
         <w:rPr>
           <w:i/>
+          <w:u w:val="single"/>
         </w:rPr>
-        <w:t>¿Tomamos chicha?</w:t>
+        <w:t>Gracias</w:t>
       </w:r>
     </w:p>
     <w:p>
       <w:r>
         <w:rPr>
           <w:b/>
+          <w:sz w:val="24"/>
         </w:rPr>
-        <w:t xml:space="preserve">JUANA: </w:t>
+        <w:t xml:space="preserve">J+kanoga+ </w:t>
       </w:r>
-      <w:r>
-        <w:rPr>
-          <w:b/>
-          <w:color w:val="1F4E79"/>
-        </w:rPr>
-        <w:t>J++, danomo jiroid+ka+ kue jofomo.</w:t>
-      </w:r>
-    </w:p>
-    <w:p>
-      <w:pPr>
-        <w:ind w:left="480"/>
-      </w:pPr>
       <w:r>
         <w:rPr>
           <w:i/>
         </w:rPr>
-        <w:t>Sí, tomemos juntos en mi casa.</w:t>
+        <w:t>(Preguntas)</w:t>
       </w:r>
     </w:p>
     <w:p>
       <w:r>
         <w:rPr>
           <w:b/>
+          <w:sz w:val="24"/>
         </w:rPr>
-        <w:t xml:space="preserve">PEDRO: </w:t>
-      </w:r>
-      <w:r>
-        <w:rPr>
-          <w:b/>
-          <w:color w:val="1F4E79"/>
-        </w:rPr>
-        <w:t>J++, kue racait+kue.</w:t>
+        <w:t>N+e izoy nemoz+?</w:t>
       </w:r>
     </w:p>
     <w:p>
-      <w:pPr>
-        <w:ind w:left="480"/>
-      </w:pPr>
       <w:r>
         <w:rPr>
           <w:i/>
         </w:rPr>
-        <w:t>Sí, te sigo.</w:t>
+        <w:t>(¿Cómo es el umarí?)</w:t>
       </w:r>
     </w:p>
     <w:p>
       <w:r>
         <w:rPr>
           <w:b/>
+          <w:sz w:val="24"/>
         </w:rPr>
-        <w:t xml:space="preserve">JUANA: </w:t>
-      </w:r>
-      <w:r>
-        <w:rPr>
-          <w:b/>
-          <w:color w:val="1F4E79"/>
-        </w:rPr>
-        <w:t>F+gora!</w:t>
+        <w:t>Nemoz+ borarede, ka+merede, jénide iemei jínide ite.</w:t>
       </w:r>
     </w:p>
     <w:p>
-      <w:pPr>
-        <w:ind w:left="480"/>
-      </w:pPr>
       <w:r>
         <w:rPr>
           <w:i/>
         </w:rPr>
-        <w:t>¡Gracias!</w:t>
+        <w:t>(El umarí es amarillo, sabroso, pequeño y maduro.)</w:t>
       </w:r>
     </w:p>
     <w:p>
       <w:r>
         <w:rPr>
           <w:b/>
+          <w:sz w:val="24"/>
         </w:rPr>
-        <w:t xml:space="preserve">PEDRO: </w:t>
-      </w:r>
-      <w:r>
-        <w:rPr>
-          <w:b/>
-          <w:color w:val="1F4E79"/>
-        </w:rPr>
-        <w:t>Jaka ñuera.</w:t>
+        <w:t>Nemoz+ n+bai guite?</w:t>
       </w:r>
     </w:p>
     <w:p>
-      <w:pPr>
-        <w:ind w:left="480"/>
-      </w:pPr>
       <w:r>
         <w:rPr>
           <w:i/>
         </w:rPr>
-        <w:t>Está bien.</w:t>
-      </w:r>
-    </w:p>
-    <w:p/>
-    <w:p>
-      <w:r>
-        <w:rPr>
-          <w:b/>
-          <w:sz w:val="26"/>
-        </w:rPr>
-        <w:t>J+kanoga+ (Preguntas)</w:t>
+        <w:t>(¿Por qué comer umarí?)</w:t>
       </w:r>
     </w:p>
     <w:p>
       <w:r>
         <w:rPr>
           <w:b/>
+          <w:sz w:val="24"/>
         </w:rPr>
-        <w:t>N+e izoy jimek+?</w:t>
-      </w:r>
-    </w:p>
-    <w:p>
-      <w:pPr>
-        <w:ind w:left="480"/>
-      </w:pPr>
-      <w:r>
-        <w:rPr>
-          <w:i/>
-        </w:rPr>
-        <w:t>¿Cómo es el chontaduro?</w:t>
+        <w:t>Nemoz+ ka+merede iemei rafe ite, jirary guiya.</w:t>
       </w:r>
     </w:p>
     <w:p>
       <w:r>
         <w:rPr>
-          <w:b/>
-        </w:rPr>
-        <w:t>Jimek+ jia+rede, ka+merede iemei jínide ite.</w:t>
-      </w:r>
-    </w:p>
-    <w:p>
-      <w:pPr>
-        <w:ind w:left="480"/>
-      </w:pPr>
-      <w:r>
-        <w:rPr>
           <w:i/>
         </w:rPr>
-        <w:t>El chontaduro es rojo, sabroso y maduro.</w:t>
-      </w:r>
-    </w:p>
-    <w:p>
-      <w:r>
-        <w:rPr>
-          <w:b/>
-        </w:rPr>
-        <w:t>N+ba jakafa+mo ta+j+d+o?</w:t>
-      </w:r>
-    </w:p>
-    <w:p>
-      <w:pPr>
-        <w:ind w:left="480"/>
-      </w:pPr>
-      <w:r>
-        <w:rPr>
-          <w:i/>
-        </w:rPr>
-        <w:t>¿Por qué trabajas en la chagra?</w:t>
-      </w:r>
-    </w:p>
-    <w:p>
-      <w:r>
-        <w:rPr>
-          <w:b/>
-        </w:rPr>
-        <w:t>Jakafa+mo jimek+ iemei nemoz+ ite, jirary ta+j+a.</w:t>
-      </w:r>
-    </w:p>
-    <w:p>
-      <w:pPr>
-        <w:ind w:left="480"/>
-      </w:pPr>
-      <w:r>
-        <w:rPr>
-          <w:i/>
-        </w:rPr>
-        <w:t>Porque en la chagra hay chontaduro y umarí, por eso trabajo.</w:t>
-      </w:r>
-    </w:p>
-    <w:p>
-      <w:r>
-        <w:br w:type="page"/>
-      </w:r>
-    </w:p>
-    <w:p>
-      <w:r>
-        <w:rPr>
-          <w:b/>
-          <w:sz w:val="28"/>
-        </w:rPr>
-        <w:t>Glosario y fuentes del vocabulario</w:t>
-      </w:r>
-    </w:p>
-    <w:p>
-      <w:r>
-        <w:t>Vocabulario tomado de las clases y ejemplos que subiste (para verificar con tu profe/apuntes):</w:t>
-      </w:r>
-    </w:p>
-    <w:tbl>
-      <w:tblPr>
-        <w:tblStyle w:val="LightGrid-Accent1"/>
-        <w:tblW w:type="auto" w:w="0"/>
-        <w:tblLook w:firstColumn="1" w:firstRow="1" w:lastColumn="0" w:lastRow="0" w:noHBand="0" w:noVBand="1" w:val="04A0"/>
-      </w:tblPr>
-      <w:tblGrid>
-        <w:gridCol w:w="2880"/>
-        <w:gridCol w:w="2880"/>
-        <w:gridCol w:w="2880"/>
-      </w:tblGrid>
-      <w:tr>
-        <w:tc>
-          <w:tcPr>
-            <w:tcW w:type="dxa" w:w="2880"/>
-          </w:tcPr>
-          <w:p>
-            <w:r>
-              <w:t>Uitoto</w:t>
-            </w:r>
-          </w:p>
-        </w:tc>
-        <w:tc>
-          <w:tcPr>
-            <w:tcW w:type="dxa" w:w="2880"/>
-          </w:tcPr>
-          <w:p>
-            <w:r>
-              <w:t>Español</w:t>
-            </w:r>
-          </w:p>
-        </w:tc>
-        <w:tc>
-          <w:tcPr>
-            <w:tcW w:type="dxa" w:w="2880"/>
-          </w:tcPr>
-          <w:p>
-            <w:r>
-              <w:t>Fuente</w:t>
-            </w:r>
-          </w:p>
-        </w:tc>
-      </w:tr>
-      <w:tr>
-        <w:tc>
-          <w:tcPr>
-            <w:tcW w:type="dxa" w:w="2880"/>
-          </w:tcPr>
-          <w:p>
-            <w:r>
-              <w:t>Mey m+n+ca</w:t>
-            </w:r>
-          </w:p>
-        </w:tc>
-        <w:tc>
-          <w:tcPr>
-            <w:tcW w:type="dxa" w:w="2880"/>
-          </w:tcPr>
-          <w:p>
-            <w:r>
-              <w:t>¿Cómo estás?</w:t>
-            </w:r>
-          </w:p>
-        </w:tc>
-        <w:tc>
-          <w:tcPr>
-            <w:tcW w:type="dxa" w:w="2880"/>
-          </w:tcPr>
-          <w:p>
-            <w:r>
-              <w:t>Ejemplo 'Untitled presentation'</w:t>
-            </w:r>
-          </w:p>
-        </w:tc>
-      </w:tr>
-      <w:tr>
-        <w:tc>
-          <w:tcPr>
-            <w:tcW w:type="dxa" w:w="2880"/>
-          </w:tcPr>
-          <w:p>
-            <w:r>
-              <w:t>Ñuera / Ñue ite / Jaka ñuera</w:t>
-            </w:r>
-          </w:p>
-        </w:tc>
-        <w:tc>
-          <w:tcPr>
-            <w:tcW w:type="dxa" w:w="2880"/>
-          </w:tcPr>
-          <w:p>
-            <w:r>
-              <w:t>Bien / Está bien</w:t>
-            </w:r>
-          </w:p>
-        </w:tc>
-        <w:tc>
-          <w:tcPr>
-            <w:tcW w:type="dxa" w:w="2880"/>
-          </w:tcPr>
-          <w:p>
-            <w:r>
-              <w:t>Clases y ejemplos</w:t>
-            </w:r>
-          </w:p>
-        </w:tc>
-      </w:tr>
-      <w:tr>
-        <w:tc>
-          <w:tcPr>
-            <w:tcW w:type="dxa" w:w="2880"/>
-          </w:tcPr>
-          <w:p>
-            <w:r>
-              <w:t>N+gafue rafue</w:t>
-            </w:r>
-          </w:p>
-        </w:tc>
-        <w:tc>
-          <w:tcPr>
-            <w:tcW w:type="dxa" w:w="2880"/>
-          </w:tcPr>
-          <w:p>
-            <w:r>
-              <w:t>¿Qué hay de nuevo?</w:t>
-            </w:r>
-          </w:p>
-        </w:tc>
-        <w:tc>
-          <w:tcPr>
-            <w:tcW w:type="dxa" w:w="2880"/>
-          </w:tcPr>
-          <w:p>
-            <w:r>
-              <w:t>Ejemplo 'Untitled presentation'</w:t>
-            </w:r>
-          </w:p>
-        </w:tc>
-      </w:tr>
-      <w:tr>
-        <w:tc>
-          <w:tcPr>
-            <w:tcW w:type="dxa" w:w="2880"/>
-          </w:tcPr>
-          <w:p>
-            <w:r>
-              <w:t>Ta+j+de → Kue ta+j+a</w:t>
-            </w:r>
-          </w:p>
-        </w:tc>
-        <w:tc>
-          <w:tcPr>
-            <w:tcW w:type="dxa" w:w="2880"/>
-          </w:tcPr>
-          <w:p>
-            <w:r>
-              <w:t>Trabajar → yo trabajo</w:t>
-            </w:r>
-          </w:p>
-        </w:tc>
-        <w:tc>
-          <w:tcPr>
-            <w:tcW w:type="dxa" w:w="2880"/>
-          </w:tcPr>
-          <w:p>
-            <w:r>
-              <w:t>Clase 2: verbos, tiempo presente</w:t>
-            </w:r>
-          </w:p>
-        </w:tc>
-      </w:tr>
-      <w:tr>
-        <w:tc>
-          <w:tcPr>
-            <w:tcW w:type="dxa" w:w="2880"/>
-          </w:tcPr>
-          <w:p>
-            <w:r>
-              <w:t>Jakafa+</w:t>
-            </w:r>
-          </w:p>
-        </w:tc>
-        <w:tc>
-          <w:tcPr>
-            <w:tcW w:type="dxa" w:w="2880"/>
-          </w:tcPr>
-          <w:p>
-            <w:r>
-              <w:t>Chagra</w:t>
-            </w:r>
-          </w:p>
-        </w:tc>
-        <w:tc>
-          <w:tcPr>
-            <w:tcW w:type="dxa" w:w="2880"/>
-          </w:tcPr>
-          <w:p>
-            <w:r>
-              <w:t>Ejemplo 'Untitled presentation'</w:t>
-            </w:r>
-          </w:p>
-        </w:tc>
-      </w:tr>
-      <w:tr>
-        <w:tc>
-          <w:tcPr>
-            <w:tcW w:type="dxa" w:w="2880"/>
-          </w:tcPr>
-          <w:p>
-            <w:r>
-              <w:t>N+e izoy…?</w:t>
-            </w:r>
-          </w:p>
-        </w:tc>
-        <w:tc>
-          <w:tcPr>
-            <w:tcW w:type="dxa" w:w="2880"/>
-          </w:tcPr>
-          <w:p>
-            <w:r>
-              <w:t>¿Cómo es…?</w:t>
-            </w:r>
-          </w:p>
-        </w:tc>
-        <w:tc>
-          <w:tcPr>
-            <w:tcW w:type="dxa" w:w="2880"/>
-          </w:tcPr>
-          <w:p>
-            <w:r>
-              <w:t>Ejemplo 'Diálogo Muruy Muina' (Bryan)</w:t>
-            </w:r>
-          </w:p>
-        </w:tc>
-      </w:tr>
-      <w:tr>
-        <w:tc>
-          <w:tcPr>
-            <w:tcW w:type="dxa" w:w="2880"/>
-          </w:tcPr>
-          <w:p>
-            <w:r>
-              <w:t>Jimek+</w:t>
-            </w:r>
-          </w:p>
-        </w:tc>
-        <w:tc>
-          <w:tcPr>
-            <w:tcW w:type="dxa" w:w="2880"/>
-          </w:tcPr>
-          <w:p>
-            <w:r>
-              <w:t>Chontaduro</w:t>
-            </w:r>
-          </w:p>
-        </w:tc>
-        <w:tc>
-          <w:tcPr>
-            <w:tcW w:type="dxa" w:w="2880"/>
-          </w:tcPr>
-          <w:p>
-            <w:r>
-              <w:t>Ejemplo 'Diálogo Muruy Muina' (Bryan)</w:t>
-            </w:r>
-          </w:p>
-        </w:tc>
-      </w:tr>
-      <w:tr>
-        <w:tc>
-          <w:tcPr>
-            <w:tcW w:type="dxa" w:w="2880"/>
-          </w:tcPr>
-          <w:p>
-            <w:r>
-              <w:t>Nemoz+</w:t>
-            </w:r>
-          </w:p>
-        </w:tc>
-        <w:tc>
-          <w:tcPr>
-            <w:tcW w:type="dxa" w:w="2880"/>
-          </w:tcPr>
-          <w:p>
-            <w:r>
-              <w:t>Fruta de umarí</w:t>
-            </w:r>
-          </w:p>
-        </w:tc>
-        <w:tc>
-          <w:tcPr>
-            <w:tcW w:type="dxa" w:w="2880"/>
-          </w:tcPr>
-          <w:p>
-            <w:r>
-              <w:t>Clase: Los colores</w:t>
-            </w:r>
-          </w:p>
-        </w:tc>
-      </w:tr>
-      <w:tr>
-        <w:tc>
-          <w:tcPr>
-            <w:tcW w:type="dxa" w:w="2880"/>
-          </w:tcPr>
-          <w:p>
-            <w:r>
-              <w:t>Iemei</w:t>
-            </w:r>
-          </w:p>
-        </w:tc>
-        <w:tc>
-          <w:tcPr>
-            <w:tcW w:type="dxa" w:w="2880"/>
-          </w:tcPr>
-          <w:p>
-            <w:r>
-              <w:t>Y</w:t>
-            </w:r>
-          </w:p>
-        </w:tc>
-        <w:tc>
-          <w:tcPr>
-            <w:tcW w:type="dxa" w:w="2880"/>
-          </w:tcPr>
-          <w:p>
-            <w:r>
-              <w:t>Clase: partes del cuerpo / ejemplos</w:t>
-            </w:r>
-          </w:p>
-        </w:tc>
-      </w:tr>
-      <w:tr>
-        <w:tc>
-          <w:tcPr>
-            <w:tcW w:type="dxa" w:w="2880"/>
-          </w:tcPr>
-          <w:p>
-            <w:r>
-              <w:t>Ite</w:t>
-            </w:r>
-          </w:p>
-        </w:tc>
-        <w:tc>
-          <w:tcPr>
-            <w:tcW w:type="dxa" w:w="2880"/>
-          </w:tcPr>
-          <w:p>
-            <w:r>
-              <w:t>Hay / ser-estar</w:t>
-            </w:r>
-          </w:p>
-        </w:tc>
-        <w:tc>
-          <w:tcPr>
-            <w:tcW w:type="dxa" w:w="2880"/>
-          </w:tcPr>
-          <w:p>
-            <w:r>
-              <w:t>Clase: sistema numérico y pronombres</w:t>
-            </w:r>
-          </w:p>
-        </w:tc>
-      </w:tr>
-      <w:tr>
-        <w:tc>
-          <w:tcPr>
-            <w:tcW w:type="dxa" w:w="2880"/>
-          </w:tcPr>
-          <w:p>
-            <w:r>
-              <w:t>Jia+rede / borarede / ka+merede</w:t>
-            </w:r>
-          </w:p>
-        </w:tc>
-        <w:tc>
-          <w:tcPr>
-            <w:tcW w:type="dxa" w:w="2880"/>
-          </w:tcPr>
-          <w:p>
-            <w:r>
-              <w:t>Rojo / amarillo / sabroso</w:t>
-            </w:r>
-          </w:p>
-        </w:tc>
-        <w:tc>
-          <w:tcPr>
-            <w:tcW w:type="dxa" w:w="2880"/>
-          </w:tcPr>
-          <w:p>
-            <w:r>
-              <w:t>Clase: Los colores y ejemplos</w:t>
-            </w:r>
-          </w:p>
-        </w:tc>
-      </w:tr>
-      <w:tr>
-        <w:tc>
-          <w:tcPr>
-            <w:tcW w:type="dxa" w:w="2880"/>
-          </w:tcPr>
-          <w:p>
-            <w:r>
-              <w:t>Juíñoi</w:t>
-            </w:r>
-          </w:p>
-        </w:tc>
-        <w:tc>
-          <w:tcPr>
-            <w:tcW w:type="dxa" w:w="2880"/>
-          </w:tcPr>
-          <w:p>
-            <w:r>
-              <w:t>Chicha</w:t>
-            </w:r>
-          </w:p>
-        </w:tc>
-        <w:tc>
-          <w:tcPr>
-            <w:tcW w:type="dxa" w:w="2880"/>
-          </w:tcPr>
-          <w:p>
-            <w:r>
-              <w:t>Ejemplo 'Diálogo Muruy Muina' (Bryan)</w:t>
-            </w:r>
-          </w:p>
-        </w:tc>
-      </w:tr>
-      <w:tr>
-        <w:tc>
-          <w:tcPr>
-            <w:tcW w:type="dxa" w:w="2880"/>
-          </w:tcPr>
-          <w:p>
-            <w:r>
-              <w:t>Jiroite</w:t>
-            </w:r>
-          </w:p>
-        </w:tc>
-        <w:tc>
-          <w:tcPr>
-            <w:tcW w:type="dxa" w:w="2880"/>
-          </w:tcPr>
-          <w:p>
-            <w:r>
-              <w:t>Tomar/beber</w:t>
-            </w:r>
-          </w:p>
-        </w:tc>
-        <w:tc>
-          <w:tcPr>
-            <w:tcW w:type="dxa" w:w="2880"/>
-          </w:tcPr>
-          <w:p>
-            <w:r>
-              <w:t>Ejemplo 'Diálogo Muruy Muina' (Bryan)</w:t>
-            </w:r>
-          </w:p>
-        </w:tc>
-      </w:tr>
-      <w:tr>
-        <w:tc>
-          <w:tcPr>
-            <w:tcW w:type="dxa" w:w="2880"/>
-          </w:tcPr>
-          <w:p>
-            <w:r>
-              <w:t>Ka+ … -d+ka+</w:t>
-            </w:r>
-          </w:p>
-        </w:tc>
-        <w:tc>
-          <w:tcPr>
-            <w:tcW w:type="dxa" w:w="2880"/>
-          </w:tcPr>
-          <w:p>
-            <w:r>
-              <w:t>Nosotros (forma verbal)</w:t>
-            </w:r>
-          </w:p>
-        </w:tc>
-        <w:tc>
-          <w:tcPr>
-            <w:tcW w:type="dxa" w:w="2880"/>
-          </w:tcPr>
-          <w:p>
-            <w:r>
-              <w:t>Ejemplo 'Untitled presentation'</w:t>
-            </w:r>
-          </w:p>
-        </w:tc>
-      </w:tr>
-      <w:tr>
-        <w:tc>
-          <w:tcPr>
-            <w:tcW w:type="dxa" w:w="2880"/>
-          </w:tcPr>
-          <w:p>
-            <w:r>
-              <w:t>Danomo</w:t>
-            </w:r>
-          </w:p>
-        </w:tc>
-        <w:tc>
-          <w:tcPr>
-            <w:tcW w:type="dxa" w:w="2880"/>
-          </w:tcPr>
-          <w:p>
-            <w:r>
-              <w:t>Juntos</w:t>
-            </w:r>
-          </w:p>
-        </w:tc>
-        <w:tc>
-          <w:tcPr>
-            <w:tcW w:type="dxa" w:w="2880"/>
-          </w:tcPr>
-          <w:p>
-            <w:r>
-              <w:t>Ejemplo 'Untitled presentation'</w:t>
-            </w:r>
-          </w:p>
-        </w:tc>
-      </w:tr>
-      <w:tr>
-        <w:tc>
-          <w:tcPr>
-            <w:tcW w:type="dxa" w:w="2880"/>
-          </w:tcPr>
-          <w:p>
-            <w:r>
-              <w:t>Jofo → jofomo</w:t>
-            </w:r>
-          </w:p>
-        </w:tc>
-        <w:tc>
-          <w:tcPr>
-            <w:tcW w:type="dxa" w:w="2880"/>
-          </w:tcPr>
-          <w:p>
-            <w:r>
-              <w:t>Casa → en/a la casa</w:t>
-            </w:r>
-          </w:p>
-        </w:tc>
-        <w:tc>
-          <w:tcPr>
-            <w:tcW w:type="dxa" w:w="2880"/>
-          </w:tcPr>
-          <w:p>
-            <w:r>
-              <w:t>Clase: Los colores (jofo) + locativo -mo</w:t>
-            </w:r>
-          </w:p>
-        </w:tc>
-      </w:tr>
-      <w:tr>
-        <w:tc>
-          <w:tcPr>
-            <w:tcW w:type="dxa" w:w="2880"/>
-          </w:tcPr>
-          <w:p>
-            <w:r>
-              <w:t>Kue racait+kue</w:t>
-            </w:r>
-          </w:p>
-        </w:tc>
-        <w:tc>
-          <w:tcPr>
-            <w:tcW w:type="dxa" w:w="2880"/>
-          </w:tcPr>
-          <w:p>
-            <w:r>
-              <w:t>Te sigo</w:t>
-            </w:r>
-          </w:p>
-        </w:tc>
-        <w:tc>
-          <w:tcPr>
-            <w:tcW w:type="dxa" w:w="2880"/>
-          </w:tcPr>
-          <w:p>
-            <w:r>
-              <w:t>Ejemplo 'Untitled presentation'</w:t>
-            </w:r>
-          </w:p>
-        </w:tc>
-      </w:tr>
-      <w:tr>
-        <w:tc>
-          <w:tcPr>
-            <w:tcW w:type="dxa" w:w="2880"/>
-          </w:tcPr>
-          <w:p>
-            <w:r>
-              <w:t>F+gora</w:t>
-            </w:r>
-          </w:p>
-        </w:tc>
-        <w:tc>
-          <w:tcPr>
-            <w:tcW w:type="dxa" w:w="2880"/>
-          </w:tcPr>
-          <w:p>
-            <w:r>
-              <w:t>Gracias</w:t>
-            </w:r>
-          </w:p>
-        </w:tc>
-        <w:tc>
-          <w:tcPr>
-            <w:tcW w:type="dxa" w:w="2880"/>
-          </w:tcPr>
-          <w:p>
-            <w:r>
-              <w:t>Todas las clases</w:t>
-            </w:r>
-          </w:p>
-        </w:tc>
-      </w:tr>
-      <w:tr>
-        <w:tc>
-          <w:tcPr>
-            <w:tcW w:type="dxa" w:w="2880"/>
-          </w:tcPr>
-          <w:p>
-            <w:r>
-              <w:t>Jirary</w:t>
-            </w:r>
-          </w:p>
-        </w:tc>
-        <w:tc>
-          <w:tcPr>
-            <w:tcW w:type="dxa" w:w="2880"/>
-          </w:tcPr>
-          <w:p>
-            <w:r>
-              <w:t>Por eso / por lo tanto</w:t>
-            </w:r>
-          </w:p>
-        </w:tc>
-        <w:tc>
-          <w:tcPr>
-            <w:tcW w:type="dxa" w:w="2880"/>
-          </w:tcPr>
-          <w:p>
-            <w:r>
-              <w:t>Ejemplo 'Untitled presentation'</w:t>
-            </w:r>
-          </w:p>
-        </w:tc>
-      </w:tr>
-    </w:tbl>
-    <w:p>
-      <w:r>
-        <w:rPr>
-          <w:i/>
-          <w:sz w:val="18"/>
-        </w:rPr>
-        <w:t>Nota: algunas conjugaciones (p. ej. 'jakafa+mo', 'jiroid+ka+', 'jofomo') se formaron por analogía con las reglas de tus clases (locativo -mo y forma de 'nosotros' -d+ka+). Confírmalas con tu profesor(a) antes de presentar.</w:t>
+        <w:t>(El umarí es sabroso y nutritivo, por eso se come.)</w:t>
       </w:r>
     </w:p>
     <w:sectPr>

</xml_diff>

<commit_message>
Variar estructura y tema (mi perro): verbos, numeros y preguntas nuevas
</commit_message>
<xml_diff>
--- a/Proyectos/Uitoto/Dialogo-Uitoto-BORRADOR.docx
+++ b/Proyectos/Uitoto/Dialogo-Uitoto-BORRADOR.docx
@@ -76,7 +76,7 @@
           <w:b/>
           <w:sz w:val="24"/>
         </w:rPr>
-        <w:t>Kue mamek+ [TU NOMBRE]+kue</w:t>
+        <w:t>Kue mamek+ [TU NOMBRE]+kue.</w:t>
       </w:r>
     </w:p>
     <w:p>
@@ -94,7 +94,7 @@
           <w:b/>
           <w:sz w:val="24"/>
         </w:rPr>
-        <w:t>Nemoz+ uai keu fiaide</w:t>
+        <w:t>Kue j+ko uai keu fiaide.</w:t>
       </w:r>
     </w:p>
     <w:p>
@@ -103,7 +103,7 @@
           <w:i/>
           <w:u w:val="single"/>
         </w:rPr>
-        <w:t>El tema que elijo es el umarí.</w:t>
+        <w:t>El tema que elijo es mi perro.</w:t>
       </w:r>
     </w:p>
     <w:p>
@@ -112,7 +112,7 @@
           <w:b/>
           <w:sz w:val="24"/>
         </w:rPr>
-        <w:t>Kue nemoz+ ga+de, nemoz+ borarede ite, jénide iemei ka+merede.</w:t>
+        <w:t>Kue j+ko jit+rede, kue j+ko ga+d+kue.</w:t>
       </w:r>
     </w:p>
     <w:p>
@@ -121,7 +121,7 @@
           <w:i/>
           <w:u w:val="single"/>
         </w:rPr>
-        <w:t>Me gusta el umarí, el umarí es amarillo, pequeño y sabroso.</w:t>
+        <w:t>Mi perro es negro, me gusta mi perro.</w:t>
       </w:r>
     </w:p>
     <w:p>
@@ -130,7 +130,7 @@
           <w:b/>
           <w:sz w:val="24"/>
         </w:rPr>
-        <w:t>Ka+merede nemoz+ juíñoi jiroite</w:t>
+        <w:t>Kue j+ko jazik+mo makade iemei aiz+de.</w:t>
       </w:r>
     </w:p>
     <w:p>
@@ -139,7 +139,7 @@
           <w:i/>
           <w:u w:val="single"/>
         </w:rPr>
-        <w:t>Yo tomé una chicha de umarí sabrosa.</w:t>
+        <w:t>Mi perro camina y corre en el monte.</w:t>
       </w:r>
     </w:p>
     <w:p>
@@ -148,7 +148,7 @@
           <w:b/>
           <w:sz w:val="24"/>
         </w:rPr>
-        <w:t>Kue nemoz+ gui ga+d+kue</w:t>
+        <w:t>Kue j+ko chamu guite.</w:t>
       </w:r>
     </w:p>
     <w:p>
@@ -157,7 +157,7 @@
           <w:i/>
           <w:u w:val="single"/>
         </w:rPr>
-        <w:t>Me gusta comer umarí.</w:t>
+        <w:t>Mi perro come pescado.</w:t>
       </w:r>
     </w:p>
     <w:p>
@@ -166,7 +166,7 @@
           <w:b/>
           <w:sz w:val="24"/>
         </w:rPr>
-        <w:t>Nemoz+ jazik+mo ite iemei rafe ite.</w:t>
+        <w:t>Kue mena j+ko iered+kue.</w:t>
       </w:r>
     </w:p>
     <w:p>
@@ -175,7 +175,7 @@
           <w:i/>
           <w:u w:val="single"/>
         </w:rPr>
-        <w:t>El umarí está en el monte y es un alimento nutritivo.</w:t>
+        <w:t>Yo tengo dos perros.</w:t>
       </w:r>
     </w:p>
     <w:p>
@@ -184,7 +184,7 @@
           <w:b/>
           <w:sz w:val="24"/>
         </w:rPr>
-        <w:t>F+gora</w:t>
+        <w:t>F+gora.</w:t>
       </w:r>
     </w:p>
     <w:p>
@@ -193,7 +193,7 @@
           <w:i/>
           <w:u w:val="single"/>
         </w:rPr>
-        <w:t>Gracias</w:t>
+        <w:t>Gracias.</w:t>
       </w:r>
     </w:p>
     <w:p>
@@ -217,7 +217,7 @@
           <w:b/>
           <w:sz w:val="24"/>
         </w:rPr>
-        <w:t>N+e izoy nemoz+?</w:t>
+        <w:t>N+e izoy o j+ko?</w:t>
       </w:r>
     </w:p>
     <w:p>
@@ -225,7 +225,7 @@
         <w:rPr>
           <w:i/>
         </w:rPr>
-        <w:t>(¿Cómo es el umarí?)</w:t>
+        <w:t>(¿Cómo es tu perro?)</w:t>
       </w:r>
     </w:p>
     <w:p>
@@ -234,7 +234,7 @@
           <w:b/>
           <w:sz w:val="24"/>
         </w:rPr>
-        <w:t>Nemoz+ borarede, ka+merede, jénide iemei jínide ite.</w:t>
+        <w:t>Kue j+ko jit+rede iemei jénide ite.</w:t>
       </w:r>
     </w:p>
     <w:p>
@@ -242,7 +242,7 @@
         <w:rPr>
           <w:i/>
         </w:rPr>
-        <w:t>(El umarí es amarillo, sabroso, pequeño y maduro.)</w:t>
+        <w:t>(Mi perro es negro y pequeño.)</w:t>
       </w:r>
     </w:p>
     <w:p>
@@ -251,7 +251,7 @@
           <w:b/>
           <w:sz w:val="24"/>
         </w:rPr>
-        <w:t>Nemoz+ n+bai guite?</w:t>
+        <w:t>N+ga j+ko iered+o?</w:t>
       </w:r>
     </w:p>
     <w:p>
@@ -259,7 +259,7 @@
         <w:rPr>
           <w:i/>
         </w:rPr>
-        <w:t>(¿Por qué comer umarí?)</w:t>
+        <w:t>(¿Cuántos perros tienes?)</w:t>
       </w:r>
     </w:p>
     <w:p>
@@ -268,7 +268,7 @@
           <w:b/>
           <w:sz w:val="24"/>
         </w:rPr>
-        <w:t>Nemoz+ ka+merede iemei rafe ite, jirary guiya.</w:t>
+        <w:t>Kue mena j+ko iered+kue.</w:t>
       </w:r>
     </w:p>
     <w:p>
@@ -276,7 +276,7 @@
         <w:rPr>
           <w:i/>
         </w:rPr>
-        <w:t>(El umarí es sabroso y nutritivo, por eso se come.)</w:t>
+        <w:t>(Yo tengo dos perros.)</w:t>
       </w:r>
     </w:p>
     <w:sectPr>

</xml_diff>

<commit_message>
Agregar nombre Santiago Ospina a la presentacion
</commit_message>
<xml_diff>
--- a/Proyectos/Uitoto/Dialogo-Uitoto-BORRADOR.docx
+++ b/Proyectos/Uitoto/Dialogo-Uitoto-BORRADOR.docx
@@ -35,7 +35,7 @@
           <w:b/>
           <w:sz w:val="24"/>
         </w:rPr>
-        <w:t>[TU NOMBRE COMPLETO]</w:t>
+        <w:t>Santiago Ospina</w:t>
       </w:r>
     </w:p>
     <w:p/>
@@ -76,7 +76,7 @@
           <w:b/>
           <w:sz w:val="24"/>
         </w:rPr>
-        <w:t>Kue mamek+ [TU NOMBRE]+kue.</w:t>
+        <w:t>Kue mamek+ Santiago+kue.</w:t>
       </w:r>
     </w:p>
     <w:p>
@@ -85,7 +85,7 @@
           <w:i/>
           <w:u w:val="single"/>
         </w:rPr>
-        <w:t>Mi nombre es [TU NOMBRE].</w:t>
+        <w:t>Mi nombre es Santiago.</w:t>
       </w:r>
     </w:p>
     <w:p>

</xml_diff>

<commit_message>
Quitar preguntas, ampliar relato coherente y corregir nuera
</commit_message>
<xml_diff>
--- a/Proyectos/Uitoto/Dialogo-Uitoto-BORRADOR.docx
+++ b/Proyectos/Uitoto/Dialogo-Uitoto-BORRADOR.docx
@@ -112,7 +112,7 @@
           <w:b/>
           <w:sz w:val="24"/>
         </w:rPr>
-        <w:t>Kue j+ko jit+rede, kue j+ko ga+d+kue.</w:t>
+        <w:t>Kue daa j+ko iered+kue.</w:t>
       </w:r>
     </w:p>
     <w:p>
@@ -121,7 +121,61 @@
           <w:i/>
           <w:u w:val="single"/>
         </w:rPr>
-        <w:t>Mi perro es negro, me gusta mi perro.</w:t>
+        <w:t>Yo tengo un perro.</w:t>
+      </w:r>
+    </w:p>
+    <w:p>
+      <w:r>
+        <w:rPr>
+          <w:b/>
+          <w:sz w:val="24"/>
+        </w:rPr>
+        <w:t>Kue j+ko jit+rede iemei jénide ite.</w:t>
+      </w:r>
+    </w:p>
+    <w:p>
+      <w:r>
+        <w:rPr>
+          <w:i/>
+          <w:u w:val="single"/>
+        </w:rPr>
+        <w:t>Mi perro es negro y pequeño.</w:t>
+      </w:r>
+    </w:p>
+    <w:p>
+      <w:r>
+        <w:rPr>
+          <w:b/>
+          <w:sz w:val="24"/>
+        </w:rPr>
+        <w:t>Kue j+ko ñuera, jirary kue j+ko ga+d+kue.</w:t>
+      </w:r>
+    </w:p>
+    <w:p>
+      <w:r>
+        <w:rPr>
+          <w:i/>
+          <w:u w:val="single"/>
+        </w:rPr>
+        <w:t>Mi perro es bueno, por eso me gusta mi perro.</w:t>
+      </w:r>
+    </w:p>
+    <w:p>
+      <w:r>
+        <w:rPr>
+          <w:b/>
+          <w:sz w:val="24"/>
+        </w:rPr>
+        <w:t>Kue j+ko jofomo ite.</w:t>
+      </w:r>
+    </w:p>
+    <w:p>
+      <w:r>
+        <w:rPr>
+          <w:i/>
+          <w:u w:val="single"/>
+        </w:rPr>
+        <w:t>Mi perro está en la casa.</w:t>
       </w:r>
     </w:p>
     <w:p>
@@ -166,7 +220,7 @@
           <w:b/>
           <w:sz w:val="24"/>
         </w:rPr>
-        <w:t>Kue mena j+ko iered+kue.</w:t>
+        <w:t>Kue j+ko iyemo noide.</w:t>
       </w:r>
     </w:p>
     <w:p>
@@ -175,7 +229,7 @@
           <w:i/>
           <w:u w:val="single"/>
         </w:rPr>
-        <w:t>Yo tengo dos perros.</w:t>
+        <w:t>Mi perro se baña en el río.</w:t>
       </w:r>
     </w:p>
     <w:p>
@@ -194,89 +248,6 @@
           <w:u w:val="single"/>
         </w:rPr>
         <w:t>Gracias.</w:t>
-      </w:r>
-    </w:p>
-    <w:p>
-      <w:r>
-        <w:rPr>
-          <w:b/>
-          <w:sz w:val="24"/>
-        </w:rPr>
-        <w:t xml:space="preserve">J+kanoga+ </w:t>
-      </w:r>
-      <w:r>
-        <w:rPr>
-          <w:i/>
-        </w:rPr>
-        <w:t>(Preguntas)</w:t>
-      </w:r>
-    </w:p>
-    <w:p>
-      <w:r>
-        <w:rPr>
-          <w:b/>
-          <w:sz w:val="24"/>
-        </w:rPr>
-        <w:t>N+e izoy o j+ko?</w:t>
-      </w:r>
-    </w:p>
-    <w:p>
-      <w:r>
-        <w:rPr>
-          <w:i/>
-        </w:rPr>
-        <w:t>(¿Cómo es tu perro?)</w:t>
-      </w:r>
-    </w:p>
-    <w:p>
-      <w:r>
-        <w:rPr>
-          <w:b/>
-          <w:sz w:val="24"/>
-        </w:rPr>
-        <w:t>Kue j+ko jit+rede iemei jénide ite.</w:t>
-      </w:r>
-    </w:p>
-    <w:p>
-      <w:r>
-        <w:rPr>
-          <w:i/>
-        </w:rPr>
-        <w:t>(Mi perro es negro y pequeño.)</w:t>
-      </w:r>
-    </w:p>
-    <w:p>
-      <w:r>
-        <w:rPr>
-          <w:b/>
-          <w:sz w:val="24"/>
-        </w:rPr>
-        <w:t>N+ga j+ko iered+o?</w:t>
-      </w:r>
-    </w:p>
-    <w:p>
-      <w:r>
-        <w:rPr>
-          <w:i/>
-        </w:rPr>
-        <w:t>(¿Cuántos perros tienes?)</w:t>
-      </w:r>
-    </w:p>
-    <w:p>
-      <w:r>
-        <w:rPr>
-          <w:b/>
-          <w:sz w:val="24"/>
-        </w:rPr>
-        <w:t>Kue mena j+ko iered+kue.</w:t>
-      </w:r>
-    </w:p>
-    <w:p>
-      <w:r>
-        <w:rPr>
-          <w:i/>
-        </w:rPr>
-        <w:t>(Yo tengo dos perros.)</w:t>
       </w:r>
     </w:p>
     <w:sectPr>

</xml_diff>